<commit_message>
feat -- NI: filling in the report
</commit_message>
<xml_diff>
--- a/42NI Nejroiformatyka/2/NI_KNT-122_Onyshchenko_19_PR2.docx
+++ b/42NI Nejroiformatyka/2/NI_KNT-122_Onyshchenko_19_PR2.docx
@@ -560,6 +560,98 @@
         <w:rPr>
           <w:lang w:val="uk-UA"/>
         </w:rPr>
+      </w:r>
+    </w:p>
+    <w:p>
+      <w:pPr>
+        <w:pStyle w:val="p11"/>
+        <w:rPr>
+          <w:lang w:val="uk-UA"/>
+        </w:rPr>
+      </w:pPr>
+      <w:r>
+        <w:rPr>
+          <w:lang w:val="uk-UA"/>
+        </w:rPr>
+        <w:t>Задача: В.2; Номер контрольних питань: 3, 13, 29, 33, 49</w:t>
+        <w:br/>
+        <w:br/>
+        <w:t>Б.2 Прогнозування надійності виробів електронної техніки</w:t>
+        <w:br/>
+        <w:br/>
+        <w:t>Вироби електронної техніки (ОСТ 11 ОДО.052.005), далі ВЕТ, являють собою ненадійні вироби, що можуть бути охарактеризовані наступними параметрами:</w:t>
+        <w:br/>
+        <w:br/>
+        <w:t>х1 – струм сітки першої зворотний, мкА;</w:t>
+        <w:br/>
+        <w:t>х2 – струм сітки першої зворотний при перегарті, мкА;</w:t>
+        <w:br/>
+        <w:t>х3 – струм анода, мА;</w:t>
+        <w:br/>
+        <w:t>х4 – струм сітки другий, мА;</w:t>
+        <w:br/>
+        <w:t>х5 – крутість характеристики, мА/В;</w:t>
+        <w:br/>
+        <w:t>х6 – крутість характеристики при недожару, мА/В;</w:t>
+        <w:br/>
+        <w:t>х7 – струм розжарення, мА;</w:t>
+        <w:br/>
+        <w:t>х8 – ємність вхідна, пф;</w:t>
+        <w:br/>
+        <w:t>х9 – ємність вихідна, пф;</w:t>
+        <w:br/>
+        <w:t>х10 – ємність прохідна, пф;</w:t>
+        <w:br/>
+        <w:t>х11 – час готовності, с;</w:t>
+        <w:br/>
+        <w:t>х12 – коефіцієнт підсилення в тріодному включенні;</w:t>
+        <w:br/>
+        <w:t>х13 – напруга контактної різниці потенціалів, В;</w:t>
+        <w:br/>
+        <w:t>х14 – відносна зміна струму анода, %;</w:t>
+        <w:br/>
+        <w:t>х15 – струм емісії при недожару, А;</w:t>
+        <w:br/>
+        <w:t>х16 – опір оксидного шару, Ом;</w:t>
+        <w:br/>
+        <w:t>х17 – струм емісії, А;</w:t>
+        <w:br/>
+        <w:t>х18 – відносна зміна крутості характеристики після іспитів на довговічність 5000 год., %.</w:t>
+        <w:br/>
+        <w:br/>
+        <w:t>Будучи піддані навантаженню в процесі експлуатації ці вироби можуть виходити з ладу в різний час. Задачею контролю якості цих виробів при завершенні виробництва, а також в експлуатації є прогнозування ресурсу (терміну служби) ВЕТ. Причому на практиці цілком достатньо якісного прогнозу, тобто досить спрогнозувати, чи зможе конкретний виріб прослужити заданий термін чи ні. Для побудови моделі якісної залежності між параметрами і класом ВЕТ можна використовувати експериментально отримані і пронормовані дані.</w:t>
+        <w:br/>
+        <w:br/>
+        <w:t>Формалізувавши задачу маємо: 18 вхідних ознак, що містять параметри ВЕТ 1 цільову ознаку - номер класу ВЕТ (1 - дефектний, 0 - гідний).</w:t>
+        <w:br/>
+        <w:br/>
+        <w:t>Кількість шарів: 2, кількість нейронів у шарах: 8-1, назва функції активації: логістична сигмоїдна.</w:t>
+      </w:r>
+    </w:p>
+    <w:p>
+      <w:pPr>
+        <w:pStyle w:val="p11"/>
+        <w:rPr>
+          <w:lang w:val="uk-UA"/>
+        </w:rPr>
+      </w:pPr>
+      <w:r>
+        <w:rPr>
+          <w:lang w:val="uk-UA"/>
+        </w:rPr>
+      </w:r>
+    </w:p>
+    <w:p>
+      <w:pPr>
+        <w:pStyle w:val="p11"/>
+        <w:rPr>
+          <w:lang w:val="uk-UA"/>
+        </w:rPr>
+      </w:pPr>
+      <w:r>
+        <w:rPr>
+          <w:lang w:val="uk-UA"/>
+        </w:rPr>
         <w:t xml:space="preserve">5. Використовуючи </w:t>
       </w:r>
       <w:r>
@@ -686,10 +778,14 @@
     <w:p>
       <w:pPr>
         <w:pStyle w:val="p11"/>
-        <w:rPr/>
-      </w:pPr>
-      <w:r>
-        <w:rPr/>
+        <w:rPr>
+          <w:lang w:val="en-US"/>
+        </w:rPr>
+      </w:pPr>
+      <w:r>
+        <w:rPr>
+          <w:lang w:val="en-US"/>
+        </w:rPr>
       </w:r>
     </w:p>
     <w:p>
@@ -704,6 +800,15 @@
     </w:p>
     <w:p>
       <w:pPr>
+        <w:pStyle w:val="p11"/>
+        <w:rPr/>
+      </w:pPr>
+      <w:r>
+        <w:rPr/>
+      </w:r>
+    </w:p>
+    <w:p>
+      <w:pPr>
         <w:pStyle w:val="h11"/>
         <w:rPr/>
       </w:pPr>
@@ -719,45 +824,7 @@
       </w:pPr>
       <w:r>
         <w:rPr/>
-        <w:t>3 Властивості штучних нейромереж.</w:t>
-      </w:r>
-    </w:p>
-    <w:p>
-      <w:pPr>
-        <w:pStyle w:val="P1"/>
-        <w:rPr/>
-      </w:pPr>
-      <w:r>
-        <w:rPr/>
-      </w:r>
-    </w:p>
-    <w:p>
-      <w:pPr>
-        <w:pStyle w:val="P1"/>
-        <w:rPr/>
-      </w:pPr>
-      <w:r>
-        <w:rPr/>
-        <w:t>Бувають одношарові або багатошарові. Складаються з нейронів. Нейрони складаються з дендритів (вхідних зв’язків) та аксона (вихідного зв’язку).</w:t>
-      </w:r>
-    </w:p>
-    <w:p>
-      <w:pPr>
-        <w:pStyle w:val="P1"/>
-        <w:rPr/>
-      </w:pPr>
-      <w:r>
-        <w:rPr/>
-        <w:t>Нейрони можуть навчатися, підлаштовуючи свої ваги на основі прикладів (навчання з учителем).</w:t>
-      </w:r>
-    </w:p>
-    <w:p>
-      <w:pPr>
-        <w:pStyle w:val="P1"/>
-        <w:rPr/>
-      </w:pPr>
-      <w:r>
-        <w:rPr/>
+        <w:t>3 Псевдоінверсне  навчальне  правило,  проективний  алгоритм настроювання ваг.</w:t>
       </w:r>
     </w:p>
     <w:p>
@@ -767,165 +834,7 @@
       </w:pPr>
       <w:r>
         <w:rPr/>
-        <w:t>13 Поняття:   формальний   нейрон,   синапс,   вага   (ваговий коефіцієнт),  поріг,  дискримінантна  (вагова)  функція,  функція активації, бажаний  і  реальний  вихід  нейромережі,  навчання нейромережі, класифікація,  апроксимація,  оцінювання,  помилка навчання / класифікації, час навчання / класифікації, цільова функція навчання.</w:t>
-      </w:r>
-    </w:p>
-    <w:p>
-      <w:pPr>
-        <w:pStyle w:val="P1"/>
-        <w:rPr/>
-      </w:pPr>
-      <w:r>
-        <w:rPr/>
-      </w:r>
-    </w:p>
-    <w:p>
-      <w:pPr>
-        <w:pStyle w:val="P1"/>
-        <w:rPr/>
-      </w:pPr>
-      <w:r>
-        <w:rPr/>
-        <w:t>- формальний нейрон — математична модель біологічного нейрону;</w:t>
-      </w:r>
-    </w:p>
-    <w:p>
-      <w:pPr>
-        <w:pStyle w:val="P1"/>
-        <w:rPr/>
-      </w:pPr>
-      <w:r>
-        <w:rPr/>
-        <w:t>- синапс — зв’язок;</w:t>
-      </w:r>
-    </w:p>
-    <w:p>
-      <w:pPr>
-        <w:pStyle w:val="P1"/>
-        <w:rPr/>
-      </w:pPr>
-      <w:r>
-        <w:rPr/>
-        <w:t>- вага (ваговий коефіцієнт) — параметр, що визначає силу впливу сигналу на нейрон;</w:t>
-      </w:r>
-    </w:p>
-    <w:p>
-      <w:pPr>
-        <w:pStyle w:val="P1"/>
-        <w:rPr/>
-      </w:pPr>
-      <w:r>
-        <w:rPr/>
-        <w:t>- поріг — параметр, що зміщує функцію активації;</w:t>
-      </w:r>
-    </w:p>
-    <w:p>
-      <w:pPr>
-        <w:pStyle w:val="P1"/>
-        <w:rPr/>
-      </w:pPr>
-      <w:r>
-        <w:rPr/>
-        <w:t>- дискримінантна (вагова) функція — спеціальна математична конструкція, яка використовується при підсумовуванні, інтегруванні чи усередненні, щоб надати більшої ваги певним елементам;</w:t>
-      </w:r>
-    </w:p>
-    <w:p>
-      <w:pPr>
-        <w:pStyle w:val="P1"/>
-        <w:rPr/>
-      </w:pPr>
-      <w:r>
-        <w:rPr/>
-        <w:t>- функція активації — перетворює сумарний сигнал на вихідний;</w:t>
-      </w:r>
-    </w:p>
-    <w:p>
-      <w:pPr>
-        <w:pStyle w:val="P1"/>
-        <w:rPr/>
-      </w:pPr>
-      <w:r>
-        <w:rPr/>
-        <w:t>- бажаний і реальний вихід нейромережі — бажаний це те що має бути за еталоном, реальний це те що обчислила мережа;</w:t>
-      </w:r>
-    </w:p>
-    <w:p>
-      <w:pPr>
-        <w:pStyle w:val="P1"/>
-        <w:rPr/>
-      </w:pPr>
-      <w:r>
-        <w:rPr/>
-        <w:t>- навчання нейромережі — здійснюється в кілька етапів, на кожному визначається різниця між прогнозом та очікуваним результатом;</w:t>
-      </w:r>
-    </w:p>
-    <w:p>
-      <w:pPr>
-        <w:pStyle w:val="P1"/>
-        <w:rPr/>
-      </w:pPr>
-      <w:r>
-        <w:rPr/>
-        <w:t>- класифікація — віднесення до групи;</w:t>
-      </w:r>
-    </w:p>
-    <w:p>
-      <w:pPr>
-        <w:pStyle w:val="P1"/>
-        <w:rPr/>
-      </w:pPr>
-      <w:r>
-        <w:rPr/>
-        <w:t>- апроксимація — обчислення неперервного значення;</w:t>
-      </w:r>
-    </w:p>
-    <w:p>
-      <w:pPr>
-        <w:pStyle w:val="P1"/>
-        <w:rPr/>
-      </w:pPr>
-      <w:r>
-        <w:rPr/>
-        <w:t>- оцінювання — процес використання вже навченої нейронної мережі для отримання результату на нових даних;</w:t>
-      </w:r>
-    </w:p>
-    <w:p>
-      <w:pPr>
-        <w:pStyle w:val="P1"/>
-        <w:rPr/>
-      </w:pPr>
-      <w:r>
-        <w:rPr/>
-        <w:t>- помилка навчання / класифікації — помилка навчання це розбіжність між реальним виходом мережі та бажаним результатом, а помилка класифікації це помилка на даних, які мережа не бачила;</w:t>
-      </w:r>
-    </w:p>
-    <w:p>
-      <w:pPr>
-        <w:pStyle w:val="P1"/>
-        <w:rPr/>
-      </w:pPr>
-      <w:r>
-        <w:rPr/>
-        <w:t>- час навчання / класифікації — навчання це час на підбір ваг, а класифікація це час отримання результатів;</w:t>
-      </w:r>
-    </w:p>
-    <w:p>
-      <w:pPr>
-        <w:pStyle w:val="P1"/>
-        <w:rPr/>
-      </w:pPr>
-      <w:r>
-        <w:rPr/>
-        <w:t>- цільова функція навчання — математичне мірило того, наскільки погано працює мережа на даних момент.</w:t>
-      </w:r>
-    </w:p>
-    <w:p>
-      <w:pPr>
-        <w:pStyle w:val="P1"/>
-        <w:rPr/>
-      </w:pPr>
-      <w:r>
-        <w:rPr/>
+        <w:t>13 Чи  доцільно  застосовувати  мережі  Хопфілда  при  вирішенні задач,  для  рішення  яких  може  використовуватися  одношаровий персептрон?</w:t>
       </w:r>
     </w:p>
     <w:p>
@@ -935,75 +844,7 @@
       </w:pPr>
       <w:r>
         <w:rPr/>
-        <w:t>29 Опишіть  суть  узагальненого  градієнтного  алгоритму. Окремі випадки узагальненого градієнтного алгоритму.</w:t>
-      </w:r>
-    </w:p>
-    <w:p>
-      <w:pPr>
-        <w:pStyle w:val="P1"/>
-        <w:rPr/>
-      </w:pPr>
-      <w:r>
-        <w:rPr/>
-      </w:r>
-    </w:p>
-    <w:p>
-      <w:pPr>
-        <w:pStyle w:val="P1"/>
-        <w:rPr/>
-      </w:pPr>
-      <w:r>
-        <w:rPr/>
-        <w:t>Суть методу полягає в покроковій зміні ваг у напрямку, протилежному до градієнта функції помилки.</w:t>
-      </w:r>
-    </w:p>
-    <w:p>
-      <w:pPr>
-        <w:pStyle w:val="P1"/>
-        <w:rPr/>
-      </w:pPr>
-      <w:r>
-        <w:rPr/>
-        <w:t>Окремі випадки:</w:t>
-      </w:r>
-    </w:p>
-    <w:p>
-      <w:pPr>
-        <w:pStyle w:val="P1"/>
-        <w:rPr/>
-      </w:pPr>
-      <w:r>
-        <w:rPr/>
-        <w:t>- зворотнє поширення помилки — градієнт обчислюється від виходу до входу через усі шари;</w:t>
-      </w:r>
-    </w:p>
-    <w:p>
-      <w:pPr>
-        <w:pStyle w:val="P1"/>
-        <w:rPr/>
-      </w:pPr>
-      <w:r>
-        <w:rPr/>
-        <w:t>- метод найшвидшого спуску — крок підбирається оптимально на кожній ітерації;</w:t>
-      </w:r>
-    </w:p>
-    <w:p>
-      <w:pPr>
-        <w:pStyle w:val="P1"/>
-        <w:rPr/>
-      </w:pPr>
-      <w:r>
-        <w:rPr/>
-        <w:t>- стохастичний градієнтний спуск — ваги оновлюються після кожного окремого прикладу, а не після всієї вибірки.</w:t>
-      </w:r>
-    </w:p>
-    <w:p>
-      <w:pPr>
-        <w:pStyle w:val="P1"/>
-        <w:rPr/>
-      </w:pPr>
-      <w:r>
-        <w:rPr/>
+        <w:t>29 Що таке генеральна сукупність, вибірка, екземпляр, ознака?</w:t>
       </w:r>
     </w:p>
     <w:p>
@@ -1013,65 +854,7 @@
       </w:pPr>
       <w:r>
         <w:rPr/>
-        <w:t xml:space="preserve">33 Застосування кластер-аналізу при навчанні радіально-базисних нейромереж. </w:t>
-      </w:r>
-    </w:p>
-    <w:p>
-      <w:pPr>
-        <w:pStyle w:val="P1"/>
-        <w:rPr/>
-      </w:pPr>
-      <w:r>
-        <w:rPr/>
-      </w:r>
-    </w:p>
-    <w:p>
-      <w:pPr>
-        <w:pStyle w:val="P1"/>
-        <w:rPr/>
-      </w:pPr>
-      <w:r>
-        <w:rPr/>
-        <w:t>У радіально-базисних мережах (RBF) навчання часто розділене на два етапи, і кластер-аналіз (наприклад, метод k-середніх) використовується на першому:</w:t>
-      </w:r>
-    </w:p>
-    <w:p>
-      <w:pPr>
-        <w:pStyle w:val="P1"/>
-        <w:rPr/>
-      </w:pPr>
-      <w:r>
-        <w:rPr/>
-        <w:t xml:space="preserve">1. Щоб визначити </w:t>
-      </w:r>
-      <w:r>
-        <w:rPr>
-          <w:lang w:val="uk-UA"/>
-        </w:rPr>
-        <w:t>центри радіальних функцій у прихованому шарі;</w:t>
-      </w:r>
-    </w:p>
-    <w:p>
-      <w:pPr>
-        <w:pStyle w:val="P1"/>
-        <w:rPr>
-          <w:lang w:val="uk-UA"/>
-        </w:rPr>
-      </w:pPr>
-      <w:r>
-        <w:rPr>
-          <w:lang w:val="uk-UA"/>
-        </w:rPr>
-        <w:t>2. Це дозволяє прихованому шару максимально точно "покрити" простір вхідних ознак.</w:t>
-      </w:r>
-    </w:p>
-    <w:p>
-      <w:pPr>
-        <w:pStyle w:val="P1"/>
-        <w:rPr/>
-      </w:pPr>
-      <w:r>
-        <w:rPr/>
+        <w:t>33 Поняття:     нейрон,     нейромережа,     нейрокомп’ютер, нейроінформатика.</w:t>
       </w:r>
     </w:p>
     <w:p>
@@ -1081,26 +864,7 @@
       </w:pPr>
       <w:r>
         <w:rPr/>
-        <w:t>49 Чи  впливає  репрезентативність  тестової  вибірки  на точність навчання персептрона по навчальній вибірці?</w:t>
-      </w:r>
-    </w:p>
-    <w:p>
-      <w:pPr>
-        <w:pStyle w:val="P1"/>
-        <w:rPr/>
-      </w:pPr>
-      <w:r>
-        <w:rPr/>
-      </w:r>
-    </w:p>
-    <w:p>
-      <w:pPr>
-        <w:pStyle w:val="P1"/>
-        <w:rPr/>
-      </w:pPr>
-      <w:r>
-        <w:rPr/>
-        <w:t>Не впливає.</w:t>
+        <w:t>49 Розпізнавання  образів:  постановка  задачі  та  можливість застосування мереж зі зворотними зв’язками.</w:t>
       </w:r>
     </w:p>
     <w:sectPr>

</xml_diff>

<commit_message>
feat: some unknown code
</commit_message>
<xml_diff>
--- a/42NI Nejroiformatyka/2/NI_KNT-122_Onyshchenko_19_PR2.docx
+++ b/42NI Nejroiformatyka/2/NI_KNT-122_Onyshchenko_19_PR2.docx
@@ -552,93 +552,98 @@
     <w:p>
       <w:pPr>
         <w:pStyle w:val="p11"/>
-        <w:rPr>
-          <w:lang w:val="uk-UA"/>
-        </w:rPr>
-      </w:pPr>
-      <w:r>
-        <w:rPr>
-          <w:lang w:val="uk-UA"/>
-        </w:rPr>
-      </w:r>
-    </w:p>
-    <w:p>
-      <w:pPr>
-        <w:pStyle w:val="p11"/>
-        <w:rPr>
-          <w:lang w:val="uk-UA"/>
-        </w:rPr>
-      </w:pPr>
-      <w:r>
-        <w:rPr>
-          <w:lang w:val="uk-UA"/>
-        </w:rPr>
+        <w:rPr/>
+      </w:pPr>
+      <w:r>
+        <w:rPr/>
         <w:t>Задача: В.2; Номер контрольних питань: 3, 13, 29, 33, 49</w:t>
+      </w:r>
+    </w:p>
+    <w:p>
+      <w:pPr>
+        <w:pStyle w:val="H2"/>
+        <w:rPr/>
+      </w:pPr>
+      <w:r>
+        <w:rPr/>
         <w:br/>
+        <w:tab/>
+        <w:t xml:space="preserve"> Б.2 Прогнозування надійності виробів електронної техніки</w:t>
+      </w:r>
+    </w:p>
+    <w:p>
+      <w:pPr>
+        <w:pStyle w:val="p11"/>
+        <w:rPr/>
+      </w:pPr>
+      <w:r>
+        <w:rPr/>
         <w:br/>
-        <w:t>Б.2 Прогнозування надійності виробів електронної техніки</w:t>
-        <w:br/>
-        <w:br/>
+        <w:tab/>
         <w:t>Вироби електронної техніки (ОСТ 11 ОДО.052.005), далі ВЕТ, являють собою ненадійні вироби, що можуть бути охарактеризовані наступними параметрами:</w:t>
         <w:br/>
-        <w:br/>
+        <w:tab/>
         <w:t>х1 – струм сітки першої зворотний, мкА;</w:t>
         <w:br/>
+        <w:tab/>
         <w:t>х2 – струм сітки першої зворотний при перегарті, мкА;</w:t>
         <w:br/>
+        <w:tab/>
         <w:t>х3 – струм анода, мА;</w:t>
         <w:br/>
+        <w:tab/>
         <w:t>х4 – струм сітки другий, мА;</w:t>
         <w:br/>
+        <w:tab/>
         <w:t>х5 – крутість характеристики, мА/В;</w:t>
         <w:br/>
+        <w:tab/>
         <w:t>х6 – крутість характеристики при недожару, мА/В;</w:t>
         <w:br/>
+        <w:tab/>
         <w:t>х7 – струм розжарення, мА;</w:t>
         <w:br/>
+        <w:tab/>
         <w:t>х8 – ємність вхідна, пф;</w:t>
         <w:br/>
+        <w:tab/>
         <w:t>х9 – ємність вихідна, пф;</w:t>
         <w:br/>
+        <w:tab/>
         <w:t>х10 – ємність прохідна, пф;</w:t>
         <w:br/>
+        <w:tab/>
         <w:t>х11 – час готовності, с;</w:t>
         <w:br/>
+        <w:tab/>
         <w:t>х12 – коефіцієнт підсилення в тріодному включенні;</w:t>
         <w:br/>
+        <w:tab/>
         <w:t>х13 – напруга контактної різниці потенціалів, В;</w:t>
         <w:br/>
+        <w:tab/>
         <w:t>х14 – відносна зміна струму анода, %;</w:t>
         <w:br/>
+        <w:tab/>
         <w:t>х15 – струм емісії при недожару, А;</w:t>
         <w:br/>
+        <w:tab/>
         <w:t>х16 – опір оксидного шару, Ом;</w:t>
         <w:br/>
+        <w:tab/>
         <w:t>х17 – струм емісії, А;</w:t>
         <w:br/>
+        <w:tab/>
         <w:t>х18 – відносна зміна крутості характеристики після іспитів на довговічність 5000 год., %.</w:t>
         <w:br/>
-        <w:br/>
+        <w:tab/>
         <w:t>Будучи піддані навантаженню в процесі експлуатації ці вироби можуть виходити з ладу в різний час. Задачею контролю якості цих виробів при завершенні виробництва, а також в експлуатації є прогнозування ресурсу (терміну служби) ВЕТ. Причому на практиці цілком достатньо якісного прогнозу, тобто досить спрогнозувати, чи зможе конкретний виріб прослужити заданий термін чи ні. Для побудови моделі якісної залежності між параметрами і класом ВЕТ можна використовувати експериментально отримані і пронормовані дані.</w:t>
         <w:br/>
-        <w:br/>
+        <w:tab/>
         <w:t>Формалізувавши задачу маємо: 18 вхідних ознак, що містять параметри ВЕТ 1 цільову ознаку - номер класу ВЕТ (1 - дефектний, 0 - гідний).</w:t>
         <w:br/>
-        <w:br/>
+        <w:tab/>
         <w:t>Кількість шарів: 2, кількість нейронів у шарах: 8-1, назва функції активації: логістична сигмоїдна.</w:t>
-      </w:r>
-    </w:p>
-    <w:p>
-      <w:pPr>
-        <w:pStyle w:val="p11"/>
-        <w:rPr>
-          <w:lang w:val="uk-UA"/>
-        </w:rPr>
-      </w:pPr>
-      <w:r>
-        <w:rPr>
-          <w:lang w:val="uk-UA"/>
-        </w:rPr>
       </w:r>
     </w:p>
     <w:p>

</xml_diff>

<commit_message>
chore: rename the diploma folder
</commit_message>
<xml_diff>
--- a/42NI Nejroiformatyka/2/NI_KNT-122_Onyshchenko_19_PR2.docx
+++ b/42NI Nejroiformatyka/2/NI_KNT-122_Onyshchenko_19_PR2.docx
@@ -580,7 +580,9 @@
         <w:rPr/>
         <w:br/>
         <w:tab/>
-        <w:t>Вироби електронної техніки (ОСТ 11 ОДО.052.005), далі ВЕТ, являють собою ненадійні вироби, що можуть бути охарактеризовані наступними параметрами:</w:t>
+        <w:t>Вироби електронної техніки (ОСТ 11 ОДО.052.005), далі ВЕТ,</w:t>
+        <w:tab/>
+        <w:t xml:space="preserve"> являють собою ненадійні вироби, що можуть бути охарактеризовані наступними параметрами:</w:t>
         <w:br/>
         <w:tab/>
         <w:t>х1 – струм сітки першої зворотний, мкА;</w:t>

</xml_diff>

<commit_message>
feat -- NI: Hopfield net copied
</commit_message>
<xml_diff>
--- a/42NI Nejroiformatyka/2/NI_KNT-122_Onyshchenko_19_PR2.docx
+++ b/42NI Nejroiformatyka/2/NI_KNT-122_Onyshchenko_19_PR2.docx
@@ -149,15 +149,7 @@
       </w:pPr>
       <w:r>
         <w:rPr/>
-        <w:t xml:space="preserve">Тема «Нейромережі </w:t>
-      </w:r>
-      <w:r>
-        <w:rPr/>
-        <w:t>зі зворотними зв’язками</w:t>
-      </w:r>
-      <w:r>
-        <w:rPr/>
-        <w:t>»</w:t>
+        <w:t>Тема «Нейромережі зі зворотними зв’язками»</w:t>
       </w:r>
     </w:p>
     <w:p>
@@ -442,7 +434,27 @@
           <w:smallCaps w:val="false"/>
           <w:spacing w:val="0"/>
         </w:rPr>
-        <w:t>Вивчити моделі і методи навчання нейромежер зі зворотними зв’язками, розглянути приклади їхнього практичного використання; порівняти їхні можливості з можливостями нейромереж прямого поширення; ознайомитися зі стандартними програмними засобами для моделювання мереж зі зворотними зв’язками.</w:t>
+        <w:t>Вивчити моделі і методи навчання нейроме</w:t>
+      </w:r>
+      <w:r>
+        <w:rPr>
+          <w:b w:val="false"/>
+          <w:i w:val="false"/>
+          <w:caps w:val="false"/>
+          <w:smallCaps w:val="false"/>
+          <w:spacing w:val="0"/>
+        </w:rPr>
+        <w:t>реж</w:t>
+      </w:r>
+      <w:r>
+        <w:rPr>
+          <w:b w:val="false"/>
+          <w:i w:val="false"/>
+          <w:caps w:val="false"/>
+          <w:smallCaps w:val="false"/>
+          <w:spacing w:val="0"/>
+        </w:rPr>
+        <w:t xml:space="preserve"> зі зворотними зв’язками, розглянути приклади їхнього практичного використання; порівняти їхні можливості з можливостями нейромереж прямого поширення; ознайомитися зі стандартними програмними засобами для моделювання мереж зі зворотними зв’язками.</w:t>
       </w:r>
       <w:r>
         <w:rPr/>
@@ -518,7 +530,7 @@
         <w:rPr>
           <w:lang w:val="uk-UA"/>
         </w:rPr>
-        <w:t>Вивчити архітектуру нейромереж Хоплфілда та Ельмана, а також метоид їхнього навчання.</w:t>
+        <w:t>Вивчити архітектуру нейромереж Хопфілда та Ельмана, а також методи їхнього навчання.</w:t>
       </w:r>
     </w:p>
     <w:p>
@@ -1672,12 +1684,12 @@
       <w:lang w:val="en-US" w:eastAsia="uk-UA"/>
     </w:rPr>
   </w:style>
-  <w:style w:type="character" w:styleId="Style12">
-    <w:name w:val="Символ нумерації"/>
+  <w:style w:type="character" w:styleId="user">
+    <w:name w:val="Символ нумерації (user)"/>
     <w:qFormat/>
     <w:rPr/>
   </w:style>
-  <w:style w:type="paragraph" w:styleId="Style13">
+  <w:style w:type="paragraph" w:styleId="Style12">
     <w:name w:val="Заголовок"/>
     <w:basedOn w:val="Normal"/>
     <w:next w:val="BodyText"/>
@@ -1687,7 +1699,7 @@
       <w:spacing w:before="240" w:after="120"/>
     </w:pPr>
     <w:rPr>
-      <w:rFonts w:ascii="Liberation Sans" w:hAnsi="Liberation Sans" w:eastAsia="Microsoft YaHei" w:cs="Lucida Sans"/>
+      <w:rFonts w:ascii="Liberation Sans" w:hAnsi="Liberation Sans" w:eastAsia="Microsoft YaHei" w:cs="Arial Unicode MS"/>
       <w:sz w:val="28"/>
       <w:szCs w:val="28"/>
     </w:rPr>
@@ -1724,7 +1736,7 @@
       <w:szCs w:val="24"/>
     </w:rPr>
   </w:style>
-  <w:style w:type="paragraph" w:styleId="Style14">
+  <w:style w:type="paragraph" w:styleId="Style13">
     <w:name w:val="Покажчик"/>
     <w:basedOn w:val="Normal"/>
     <w:qFormat/>
@@ -1732,10 +1744,10 @@
       <w:suppressLineNumbers/>
     </w:pPr>
     <w:rPr>
-      <w:rFonts w:cs="Lucida Sans"/>
-    </w:rPr>
-  </w:style>
-  <w:style w:type="paragraph" w:styleId="user">
+      <w:rFonts w:cs="Arial Unicode MS"/>
+    </w:rPr>
+  </w:style>
+  <w:style w:type="paragraph" w:styleId="user1">
     <w:name w:val="Заголовок (user)"/>
     <w:basedOn w:val="Normal"/>
     <w:next w:val="BodyText"/>
@@ -1745,12 +1757,12 @@
       <w:spacing w:before="240" w:after="120"/>
     </w:pPr>
     <w:rPr>
-      <w:rFonts w:ascii="Liberation Sans" w:hAnsi="Liberation Sans" w:eastAsia="Microsoft YaHei" w:cs="Arial Unicode MS"/>
+      <w:rFonts w:ascii="Liberation Sans" w:hAnsi="Liberation Sans" w:eastAsia="Microsoft YaHei" w:cs="Lucida Sans"/>
       <w:sz w:val="28"/>
       <w:szCs w:val="28"/>
     </w:rPr>
   </w:style>
-  <w:style w:type="paragraph" w:styleId="user1">
+  <w:style w:type="paragraph" w:styleId="user2">
     <w:name w:val="Покажчик (user)"/>
     <w:basedOn w:val="Normal"/>
     <w:qFormat/>
@@ -1758,12 +1770,12 @@
       <w:suppressLineNumbers/>
     </w:pPr>
     <w:rPr>
-      <w:rFonts w:cs="Arial Unicode MS"/>
+      <w:rFonts w:cs="Lucida Sans"/>
     </w:rPr>
   </w:style>
   <w:style w:type="paragraph" w:styleId="IndexHeading">
     <w:name w:val="index heading"/>
-    <w:basedOn w:val="user"/>
+    <w:basedOn w:val="Style12"/>
     <w:pPr/>
     <w:rPr/>
   </w:style>
@@ -2038,8 +2050,8 @@
     </w:pPr>
     <w:rPr/>
   </w:style>
-  <w:style w:type="numbering" w:styleId="user2" w:default="1">
-    <w:name w:val="Без маркерів (user)"/>
+  <w:style w:type="numbering" w:styleId="Style14" w:default="1">
+    <w:name w:val="Без маркерів"/>
     <w:uiPriority w:val="99"/>
     <w:semiHidden/>
     <w:unhideWhenUsed/>

</xml_diff>

<commit_message>
refactor -- D: sort the methods
</commit_message>
<xml_diff>
--- a/42NI Nejroiformatyka/2/NI_KNT-122_Onyshchenko_19_PR2.docx
+++ b/42NI Nejroiformatyka/2/NI_KNT-122_Onyshchenko_19_PR2.docx
@@ -434,7 +434,264 @@
           <w:smallCaps w:val="false"/>
           <w:spacing w:val="0"/>
         </w:rPr>
-        <w:t>Вивчити моделі і методи навчання нейроме</w:t>
+        <w:t>Вивчити моделі і методи навчання нейромереж зі зворотними зв’язками, розглянути приклади їхнього практичного використання; порівняти їхні можливості з можливостями нейромереж прямого поширення; ознайомитися зі стандартними програмними засобами для моделювання мереж зі зворотними зв’язками.</w:t>
+      </w:r>
+      <w:r>
+        <w:rPr/>
+        <w:t xml:space="preserve"> </w:t>
+      </w:r>
+    </w:p>
+    <w:p>
+      <w:pPr>
+        <w:pStyle w:val="p11"/>
+        <w:rPr/>
+      </w:pPr>
+      <w:r>
+        <w:rPr/>
+      </w:r>
+    </w:p>
+    <w:p>
+      <w:pPr>
+        <w:pStyle w:val="h11"/>
+        <w:rPr/>
+      </w:pPr>
+      <w:r>
+        <w:rPr/>
+        <w:t>Завдання</w:t>
+      </w:r>
+    </w:p>
+    <w:p>
+      <w:pPr>
+        <w:pStyle w:val="p11"/>
+        <w:rPr/>
+      </w:pPr>
+      <w:r>
+        <w:rPr/>
+      </w:r>
+    </w:p>
+    <w:p>
+      <w:pPr>
+        <w:pStyle w:val="p11"/>
+        <w:rPr/>
+      </w:pPr>
+      <w:r>
+        <w:rPr/>
+        <w:t>Завдання на роботу:</w:t>
+      </w:r>
+    </w:p>
+    <w:p>
+      <w:pPr>
+        <w:pStyle w:val="p11"/>
+        <w:rPr>
+          <w:lang w:val="en-US"/>
+        </w:rPr>
+      </w:pPr>
+      <w:r>
+        <w:rPr>
+          <w:lang w:val="en-US"/>
+        </w:rPr>
+        <w:t>1. Ознайомитися з конспектом лекцій та рекомендованою літературою.</w:t>
+      </w:r>
+    </w:p>
+    <w:p>
+      <w:pPr>
+        <w:pStyle w:val="p11"/>
+        <w:rPr>
+          <w:lang w:val="uk-UA"/>
+        </w:rPr>
+      </w:pPr>
+      <w:r>
+        <w:rPr>
+          <w:lang w:val="en-US"/>
+        </w:rPr>
+        <w:t xml:space="preserve">2. </w:t>
+      </w:r>
+      <w:r>
+        <w:rPr>
+          <w:lang w:val="uk-UA"/>
+        </w:rPr>
+        <w:t>Вивчити архітектуру нейромереж Хопфілда та Ельмана, а також методи їхнього навчання.</w:t>
+      </w:r>
+    </w:p>
+    <w:p>
+      <w:pPr>
+        <w:pStyle w:val="p11"/>
+        <w:rPr>
+          <w:lang w:val="uk-UA"/>
+        </w:rPr>
+      </w:pPr>
+      <w:r>
+        <w:rPr>
+          <w:lang w:val="uk-UA"/>
+        </w:rPr>
+        <w:t>3. Використовуючи документацію рекомендованого викладачем програмного засобу, вивчити його архітектуру і компоненти, призначені для моделювання і навчання нейромереж зі зворотними зв’язками, введення і виведення даних, підготовки звітів (виведення і відображення результатів роботи).</w:t>
+      </w:r>
+    </w:p>
+    <w:p>
+      <w:pPr>
+        <w:pStyle w:val="p11"/>
+        <w:rPr>
+          <w:lang w:val="uk-UA"/>
+        </w:rPr>
+      </w:pPr>
+      <w:r>
+        <w:rPr>
+          <w:lang w:val="uk-UA"/>
+        </w:rPr>
+        <w:t>4. Визначити за таблицею 1.1 згідно з номером варіанта студента (обирається за журналом) номер підрозділу Додатку В, що містить опис прикладної задачі, та номери контрольних питань до даної роботи, відповіді на які належить навести у звіті.</w:t>
+      </w:r>
+    </w:p>
+    <w:p>
+      <w:pPr>
+        <w:pStyle w:val="p11"/>
+        <w:rPr/>
+      </w:pPr>
+      <w:r>
+        <w:rPr/>
+        <w:t>Задача: В.2; Номер контрольних питань: 3, 13, 29, 33, 49</w:t>
+      </w:r>
+    </w:p>
+    <w:p>
+      <w:pPr>
+        <w:pStyle w:val="H2"/>
+        <w:rPr/>
+      </w:pPr>
+      <w:r>
+        <w:rPr/>
+        <w:br/>
+        <w:tab/>
+        <w:t xml:space="preserve"> Б.2 Прогнозування надійності виробів електронної техніки</w:t>
+      </w:r>
+    </w:p>
+    <w:p>
+      <w:pPr>
+        <w:pStyle w:val="p11"/>
+        <w:rPr/>
+      </w:pPr>
+      <w:r>
+        <w:rPr/>
+        <w:br/>
+        <w:tab/>
+        <w:t>Вироби електронної техніки (ОСТ 11 ОДО.052.005), далі ВЕТ,</w:t>
+        <w:tab/>
+        <w:t xml:space="preserve"> являють собою ненадійні вироби, що можуть бути охарактеризовані наступними параметрами:</w:t>
+        <w:br/>
+        <w:tab/>
+        <w:t>х1 – струм сітки першої зворотний, мкА;</w:t>
+        <w:br/>
+        <w:tab/>
+        <w:t>х2 – струм сітки першої зворотний при перегарті, мкА;</w:t>
+        <w:br/>
+        <w:tab/>
+        <w:t>х3 – струм анода, мА;</w:t>
+        <w:br/>
+        <w:tab/>
+        <w:t>х4 – струм сітки другий, мА;</w:t>
+        <w:br/>
+        <w:tab/>
+        <w:t>х5 – крутість характеристики, мА/В;</w:t>
+        <w:br/>
+        <w:tab/>
+        <w:t>х6 – крутість характеристики при недожару, мА/В;</w:t>
+        <w:br/>
+        <w:tab/>
+        <w:t>х7 – струм розжарення, мА;</w:t>
+        <w:br/>
+        <w:tab/>
+        <w:t>х8 – ємність вхідна, пф;</w:t>
+        <w:br/>
+        <w:tab/>
+        <w:t>х9 – ємність вихідна, пф;</w:t>
+        <w:br/>
+        <w:tab/>
+        <w:t>х10 – ємність прохідна, пф;</w:t>
+        <w:br/>
+        <w:tab/>
+        <w:t>х11 – час готовності, с;</w:t>
+        <w:br/>
+        <w:tab/>
+        <w:t>х12 – коефіцієнт підсилення в тріодному включенні;</w:t>
+        <w:br/>
+        <w:tab/>
+        <w:t>х13 – напруга контактної різниці потенціалів, В;</w:t>
+        <w:br/>
+        <w:tab/>
+        <w:t>х14 – відносна зміна струму анода, %;</w:t>
+        <w:br/>
+        <w:tab/>
+        <w:t>х15 – струм емісії при недожару, А;</w:t>
+        <w:br/>
+        <w:tab/>
+        <w:t>х16 – опір оксидного шару, Ом;</w:t>
+        <w:br/>
+        <w:tab/>
+        <w:t>х17 – струм емісії, А;</w:t>
+        <w:br/>
+        <w:tab/>
+        <w:t>х18 – відносна зміна крутості характеристики після іспитів на довговічність 5000 год., %.</w:t>
+        <w:br/>
+        <w:tab/>
+        <w:t>Будучи піддані навантаженню в процесі експлуатації ці вироби можуть виходити з ладу в різний час. Задачею контролю якості цих виробів при завершенні виробництва, а також в експлуатації є прогнозування ресурсу (терміну служби) ВЕТ. Причому на практиці цілком достатньо якісного прогнозу, тобто досить спрогнозувати, чи зможе конкретний виріб прослужити заданий термін чи ні. Для побудови моделі якісної залежності між параметрами і класом ВЕТ можна використовувати експериментально отримані і пронормовані дані.</w:t>
+        <w:br/>
+        <w:tab/>
+        <w:t>Формалізувавши задачу маємо: 18 вхідних ознак, що містять параметри ВЕТ 1 цільову ознаку - номер класу ВЕТ (1 - дефектний, 0 - гідний).</w:t>
+        <w:br/>
+        <w:tab/>
+        <w:t>Кількість шарів: 2, кількість нейронів у шарах: 8-1, назва функції активації: логістична сигмоїдна.</w:t>
+      </w:r>
+    </w:p>
+    <w:p>
+      <w:pPr>
+        <w:pStyle w:val="p11"/>
+        <w:rPr>
+          <w:lang w:val="uk-UA"/>
+        </w:rPr>
+      </w:pPr>
+      <w:r>
+        <w:rPr>
+          <w:lang w:val="uk-UA"/>
+        </w:rPr>
+        <w:t xml:space="preserve">5. Використовуючи </w:t>
+      </w:r>
+      <w:r>
+        <w:rPr>
+          <w:lang w:val="en-US"/>
+        </w:rPr>
+        <w:t xml:space="preserve">Python </w:t>
+      </w:r>
+      <w:r>
+        <w:rPr>
+          <w:lang w:val="uk-UA"/>
+        </w:rPr>
+        <w:t>для відповідних варіантів студента вхідних даних вирішити прикладну задачу на основі нейромереж Хопфілда та Ельмана.</w:t>
+      </w:r>
+    </w:p>
+    <w:p>
+      <w:pPr>
+        <w:pStyle w:val="p11"/>
+        <w:rPr>
+          <w:lang w:val="uk-UA"/>
+        </w:rPr>
+      </w:pPr>
+      <w:r>
+        <w:rPr>
+          <w:lang w:val="uk-UA"/>
+        </w:rPr>
+        <w:t>6. Зберегти у файлі на диску початкові параметри нейромоделей, результати їхнього навчання (матрицю ваг та структуру з значенням функцій активації і кількості нейроелементів у шарах) та робити для навчальної та контрольної вибірок (помилку класифікації (оцінювання), значення на входах і виході, час навчання, час класифікації).</w:t>
+      </w:r>
+    </w:p>
+    <w:p>
+      <w:pPr>
+        <w:pStyle w:val="p11"/>
+        <w:rPr>
+          <w:lang w:val="uk-UA"/>
+        </w:rPr>
+      </w:pPr>
+      <w:r>
+        <w:rPr>
+          <w:lang w:val="uk-UA"/>
+        </w:rPr>
+        <w:t xml:space="preserve">7. Результати виконання пунктів 5-6 занести в таблицю, стовпці якої повинні мати назви: </w:t>
       </w:r>
       <w:r>
         <w:rPr>
@@ -444,7 +701,27 @@
           <w:smallCaps w:val="false"/>
           <w:spacing w:val="0"/>
         </w:rPr>
-        <w:t>реж</w:t>
+        <w:t>назва архітектури нейромережі, кількість шарів, кількість нейронів у шарах, функції активації нейронів у шарах, метод навчання, час навчання, час класифікації навченої мережі для навчальної вибірки, помилка класифікації для навчальної вибірки, час класифікації навченої мережі для тестової вибірки, помилка класифікації для тестової вибірки.</w:t>
+      </w:r>
+      <w:r>
+        <w:rPr>
+          <w:lang w:val="uk-UA"/>
+        </w:rPr>
+        <w:t xml:space="preserve"> </w:t>
+      </w:r>
+    </w:p>
+    <w:p>
+      <w:pPr>
+        <w:pStyle w:val="p11"/>
+        <w:rPr>
+          <w:lang w:val="uk-UA"/>
+        </w:rPr>
+      </w:pPr>
+      <w:r>
+        <w:rPr>
+          <w:lang w:val="uk-UA"/>
+        </w:rPr>
+        <w:t xml:space="preserve">8. </w:t>
       </w:r>
       <w:r>
         <w:rPr>
@@ -454,20 +731,60 @@
           <w:smallCaps w:val="false"/>
           <w:spacing w:val="0"/>
         </w:rPr>
-        <w:t xml:space="preserve"> зі зворотними зв’язками, розглянути приклади їхнього практичного використання; порівняти їхні можливості з можливостями нейромереж прямого поширення; ознайомитися зі стандартними програмними засобами для моделювання мереж зі зворотними зв’язками.</w:t>
-      </w:r>
-      <w:r>
-        <w:rPr/>
-        <w:t xml:space="preserve"> </w:t>
-      </w:r>
-    </w:p>
-    <w:p>
-      <w:pPr>
-        <w:pStyle w:val="p11"/>
-        <w:rPr/>
-      </w:pPr>
-      <w:r>
-        <w:rPr/>
+        <w:t>Проаналізувати отримані результати і дати порівняльну характеристику мереж Хопфілда та Ельмана. Дати порівняльну характеристику мереж зі зворотними зв’язками та мереж прямого поширення за швидкістю навчання і точністю класифікації; принципами побудови архітектури.</w:t>
+      </w:r>
+    </w:p>
+    <w:p>
+      <w:pPr>
+        <w:pStyle w:val="p11"/>
+        <w:rPr>
+          <w:lang w:val="en-US"/>
+        </w:rPr>
+      </w:pPr>
+      <w:r>
+        <w:rPr>
+          <w:lang w:val="uk-UA"/>
+        </w:rPr>
+        <w:t>9</w:t>
+      </w:r>
+      <w:r>
+        <w:rPr>
+          <w:lang w:val="en-US"/>
+        </w:rPr>
+        <w:t>. Відповісти на контрольні питання.</w:t>
+      </w:r>
+    </w:p>
+    <w:p>
+      <w:pPr>
+        <w:pStyle w:val="p11"/>
+        <w:rPr>
+          <w:lang w:val="en-US"/>
+        </w:rPr>
+      </w:pPr>
+      <w:r>
+        <w:rPr>
+          <w:lang w:val="uk-UA"/>
+        </w:rPr>
+        <w:t>10</w:t>
+      </w:r>
+      <w:r>
+        <w:rPr>
+          <w:lang w:val="en-US"/>
+        </w:rPr>
+        <w:t>. Оформити звіт з роботи.</w:t>
+      </w:r>
+    </w:p>
+    <w:p>
+      <w:pPr>
+        <w:pStyle w:val="p11"/>
+        <w:rPr>
+          <w:lang w:val="en-US"/>
+        </w:rPr>
+      </w:pPr>
+      <w:r>
+        <w:rPr>
+          <w:lang w:val="en-US"/>
+        </w:rPr>
       </w:r>
     </w:p>
     <w:p>
@@ -477,98 +794,7 @@
       </w:pPr>
       <w:r>
         <w:rPr/>
-        <w:t>Завдання</w:t>
-      </w:r>
-    </w:p>
-    <w:p>
-      <w:pPr>
-        <w:pStyle w:val="p11"/>
-        <w:rPr/>
-      </w:pPr>
-      <w:r>
-        <w:rPr/>
-      </w:r>
-    </w:p>
-    <w:p>
-      <w:pPr>
-        <w:pStyle w:val="p11"/>
-        <w:rPr/>
-      </w:pPr>
-      <w:r>
-        <w:rPr/>
-        <w:t>Завдання на роботу:</w:t>
-      </w:r>
-    </w:p>
-    <w:p>
-      <w:pPr>
-        <w:pStyle w:val="p11"/>
-        <w:rPr>
-          <w:lang w:val="en-US"/>
-        </w:rPr>
-      </w:pPr>
-      <w:r>
-        <w:rPr>
-          <w:lang w:val="en-US"/>
-        </w:rPr>
-        <w:t>1. Ознайомитися з конспектом лекцій та рекомендованою літературою.</w:t>
-      </w:r>
-    </w:p>
-    <w:p>
-      <w:pPr>
-        <w:pStyle w:val="p11"/>
-        <w:rPr>
-          <w:lang w:val="uk-UA"/>
-        </w:rPr>
-      </w:pPr>
-      <w:r>
-        <w:rPr>
-          <w:lang w:val="en-US"/>
-        </w:rPr>
-        <w:t xml:space="preserve">2. </w:t>
-      </w:r>
-      <w:r>
-        <w:rPr>
-          <w:lang w:val="uk-UA"/>
-        </w:rPr>
-        <w:t>Вивчити архітектуру нейромереж Хопфілда та Ельмана, а також методи їхнього навчання.</w:t>
-      </w:r>
-    </w:p>
-    <w:p>
-      <w:pPr>
-        <w:pStyle w:val="p11"/>
-        <w:rPr>
-          <w:lang w:val="uk-UA"/>
-        </w:rPr>
-      </w:pPr>
-      <w:r>
-        <w:rPr>
-          <w:lang w:val="uk-UA"/>
-        </w:rPr>
-        <w:t>3. Використовуючи документацію рекомендованого викладачем програмного засобу, вивчити його архітектуру і компоненти, призначені для моделювання і навчання нейромереж зі зворотними зв’язками, введення і виведення даних, підготовки звітів (виведення і відображення результатів роботи).</w:t>
-      </w:r>
-    </w:p>
-    <w:p>
-      <w:pPr>
-        <w:pStyle w:val="p11"/>
-        <w:rPr>
-          <w:lang w:val="uk-UA"/>
-        </w:rPr>
-      </w:pPr>
-      <w:r>
-        <w:rPr>
-          <w:lang w:val="uk-UA"/>
-        </w:rPr>
-        <w:t>4. Визначити за таблицею 1.1 згідно з номером варіанта студента (обирається за журналом) номер підрозділу Додатку В, що містить опис прикладної задачі, та номери контрольних питань до даної роботи, відповіді на які належить навести у звіті.</w:t>
-      </w:r>
-    </w:p>
-    <w:p>
-      <w:pPr>
-        <w:pStyle w:val="p11"/>
-        <w:rPr/>
-      </w:pPr>
-      <w:r>
-        <w:rPr/>
-        <w:t>Задача: В.2; Номер контрольних питань: 3, 13, 29, 33, 49</w:t>
+        <w:t>Виконання</w:t>
       </w:r>
     </w:p>
     <w:p>
@@ -578,248 +804,675 @@
       </w:pPr>
       <w:r>
         <w:rPr/>
-        <w:br/>
-        <w:tab/>
-        <w:t xml:space="preserve"> Б.2 Прогнозування надійності виробів електронної техніки</w:t>
-      </w:r>
-    </w:p>
-    <w:p>
-      <w:pPr>
-        <w:pStyle w:val="p11"/>
-        <w:rPr/>
-      </w:pPr>
-      <w:r>
-        <w:rPr/>
-        <w:br/>
-        <w:tab/>
-        <w:t>Вироби електронної техніки (ОСТ 11 ОДО.052.005), далі ВЕТ,</w:t>
-        <w:tab/>
-        <w:t xml:space="preserve"> являють собою ненадійні вироби, що можуть бути охарактеризовані наступними параметрами:</w:t>
-        <w:br/>
-        <w:tab/>
-        <w:t>х1 – струм сітки першої зворотний, мкА;</w:t>
-        <w:br/>
-        <w:tab/>
-        <w:t>х2 – струм сітки першої зворотний при перегарті, мкА;</w:t>
-        <w:br/>
-        <w:tab/>
-        <w:t>х3 – струм анода, мА;</w:t>
-        <w:br/>
-        <w:tab/>
-        <w:t>х4 – струм сітки другий, мА;</w:t>
-        <w:br/>
-        <w:tab/>
-        <w:t>х5 – крутість характеристики, мА/В;</w:t>
-        <w:br/>
-        <w:tab/>
-        <w:t>х6 – крутість характеристики при недожару, мА/В;</w:t>
-        <w:br/>
-        <w:tab/>
-        <w:t>х7 – струм розжарення, мА;</w:t>
-        <w:br/>
-        <w:tab/>
-        <w:t>х8 – ємність вхідна, пф;</w:t>
-        <w:br/>
-        <w:tab/>
-        <w:t>х9 – ємність вихідна, пф;</w:t>
-        <w:br/>
-        <w:tab/>
-        <w:t>х10 – ємність прохідна, пф;</w:t>
-        <w:br/>
-        <w:tab/>
-        <w:t>х11 – час готовності, с;</w:t>
-        <w:br/>
-        <w:tab/>
-        <w:t>х12 – коефіцієнт підсилення в тріодному включенні;</w:t>
-        <w:br/>
-        <w:tab/>
-        <w:t>х13 – напруга контактної різниці потенціалів, В;</w:t>
-        <w:br/>
-        <w:tab/>
-        <w:t>х14 – відносна зміна струму анода, %;</w:t>
-        <w:br/>
-        <w:tab/>
-        <w:t>х15 – струм емісії при недожару, А;</w:t>
-        <w:br/>
-        <w:tab/>
-        <w:t>х16 – опір оксидного шару, Ом;</w:t>
-        <w:br/>
-        <w:tab/>
-        <w:t>х17 – струм емісії, А;</w:t>
-        <w:br/>
-        <w:tab/>
-        <w:t>х18 – відносна зміна крутості характеристики після іспитів на довговічність 5000 год., %.</w:t>
-        <w:br/>
-        <w:tab/>
-        <w:t>Будучи піддані навантаженню в процесі експлуатації ці вироби можуть виходити з ладу в різний час. Задачею контролю якості цих виробів при завершенні виробництва, а також в експлуатації є прогнозування ресурсу (терміну служби) ВЕТ. Причому на практиці цілком достатньо якісного прогнозу, тобто досить спрогнозувати, чи зможе конкретний виріб прослужити заданий термін чи ні. Для побудови моделі якісної залежності між параметрами і класом ВЕТ можна використовувати експериментально отримані і пронормовані дані.</w:t>
-        <w:br/>
-        <w:tab/>
-        <w:t>Формалізувавши задачу маємо: 18 вхідних ознак, що містять параметри ВЕТ 1 цільову ознаку - номер класу ВЕТ (1 - дефектний, 0 - гідний).</w:t>
-        <w:br/>
-        <w:tab/>
-        <w:t>Кількість шарів: 2, кількість нейронів у шарах: 8-1, назва функції активації: логістична сигмоїдна.</w:t>
-      </w:r>
-    </w:p>
-    <w:p>
-      <w:pPr>
-        <w:pStyle w:val="p11"/>
-        <w:rPr>
-          <w:lang w:val="uk-UA"/>
-        </w:rPr>
-      </w:pPr>
-      <w:r>
-        <w:rPr>
-          <w:lang w:val="uk-UA"/>
-        </w:rPr>
-        <w:t xml:space="preserve">5. Використовуючи </w:t>
-      </w:r>
-      <w:r>
-        <w:rPr>
-          <w:lang w:val="en-US"/>
-        </w:rPr>
-        <w:t xml:space="preserve">Python </w:t>
-      </w:r>
-      <w:r>
-        <w:rPr>
-          <w:lang w:val="uk-UA"/>
-        </w:rPr>
-        <w:t>для відповідних варіантів студента вхідних даних вирішити прикладну задачу на основі нейромереж Хопфілда та Ельмана.</w:t>
-      </w:r>
-    </w:p>
-    <w:p>
-      <w:pPr>
-        <w:pStyle w:val="p11"/>
-        <w:rPr>
-          <w:lang w:val="uk-UA"/>
-        </w:rPr>
-      </w:pPr>
-      <w:r>
-        <w:rPr>
-          <w:lang w:val="uk-UA"/>
-        </w:rPr>
-        <w:t>6. Зберегти у файлі на диску початкові параметри нейромоделей, результати їхнього навчання (матрицю ваг та структуру з значенням функцій активації і кількості нейроелементів у шарах) та робити для навчальної та контрольної вибірок (помилку класифікації (оцінювання), значення на входах і виході, час навчання, час класифікації).</w:t>
-      </w:r>
-    </w:p>
-    <w:p>
-      <w:pPr>
-        <w:pStyle w:val="p11"/>
-        <w:rPr>
-          <w:lang w:val="uk-UA"/>
-        </w:rPr>
-      </w:pPr>
-      <w:r>
-        <w:rPr>
-          <w:lang w:val="uk-UA"/>
-        </w:rPr>
-        <w:t xml:space="preserve">7. Результати виконання пунктів 5-6 занести в таблицю, стовпці якої повинні мати назви: </w:t>
-      </w:r>
-      <w:r>
-        <w:rPr>
-          <w:b w:val="false"/>
-          <w:i w:val="false"/>
-          <w:caps w:val="false"/>
-          <w:smallCaps w:val="false"/>
-          <w:spacing w:val="0"/>
-        </w:rPr>
-        <w:t>назва архітектури нейромережі, кількість шарів, кількість нейронів у шарах, функції активації нейронів у шарах, метод навчання, час навчання, час класифікації навченої мережі для навчальної вибірки, помилка класифікації для навчальної вибірки, час класифікації навченої мережі для тестової вибірки, помилка класифікації для тестової вибірки.</w:t>
-      </w:r>
-      <w:r>
-        <w:rPr>
-          <w:lang w:val="uk-UA"/>
-        </w:rPr>
-        <w:t xml:space="preserve"> </w:t>
-      </w:r>
-    </w:p>
-    <w:p>
-      <w:pPr>
-        <w:pStyle w:val="p11"/>
-        <w:rPr>
-          <w:lang w:val="uk-UA"/>
-        </w:rPr>
-      </w:pPr>
-      <w:r>
-        <w:rPr>
-          <w:lang w:val="uk-UA"/>
-        </w:rPr>
-        <w:t xml:space="preserve">8. </w:t>
-      </w:r>
-      <w:r>
-        <w:rPr>
-          <w:b w:val="false"/>
-          <w:i w:val="false"/>
-          <w:caps w:val="false"/>
-          <w:smallCaps w:val="false"/>
-          <w:spacing w:val="0"/>
-        </w:rPr>
-        <w:t>Проаналізувати отримані результати і дати порівняльну характеристику мереж Хопфілда та Ельмана. Дати порівняльну характеристику мереж зі зворотними зв’язками та мереж прямого поширення за швидкістю навчання і точністю класифікації; принципами побудови архітектури.</w:t>
-      </w:r>
-    </w:p>
-    <w:p>
-      <w:pPr>
-        <w:pStyle w:val="p11"/>
-        <w:rPr>
-          <w:lang w:val="en-US"/>
-        </w:rPr>
-      </w:pPr>
-      <w:r>
-        <w:rPr>
-          <w:lang w:val="uk-UA"/>
-        </w:rPr>
-        <w:t>9</w:t>
-      </w:r>
-      <w:r>
-        <w:rPr>
-          <w:lang w:val="en-US"/>
-        </w:rPr>
-        <w:t>. Відповісти на контрольні питання.</w:t>
-      </w:r>
-    </w:p>
-    <w:p>
-      <w:pPr>
-        <w:pStyle w:val="p11"/>
-        <w:rPr>
-          <w:lang w:val="en-US"/>
-        </w:rPr>
-      </w:pPr>
-      <w:r>
-        <w:rPr>
-          <w:lang w:val="uk-UA"/>
-        </w:rPr>
-        <w:t>10</w:t>
-      </w:r>
-      <w:r>
-        <w:rPr>
-          <w:lang w:val="en-US"/>
-        </w:rPr>
-        <w:t>. Оформити звіт з роботи.</w:t>
-      </w:r>
-    </w:p>
-    <w:p>
-      <w:pPr>
-        <w:pStyle w:val="p11"/>
-        <w:rPr>
-          <w:lang w:val="en-US"/>
-        </w:rPr>
-      </w:pPr>
-      <w:r>
-        <w:rPr>
-          <w:lang w:val="en-US"/>
-        </w:rPr>
-      </w:r>
-    </w:p>
-    <w:p>
-      <w:pPr>
-        <w:pStyle w:val="h11"/>
-        <w:rPr/>
-      </w:pPr>
-      <w:r>
-        <w:rPr/>
-        <w:t>Виконання</w:t>
-      </w:r>
-    </w:p>
-    <w:p>
-      <w:pPr>
-        <w:pStyle w:val="p11"/>
+        <w:t>Код</w:t>
+      </w:r>
+    </w:p>
+    <w:p>
+      <w:pPr>
+        <w:pStyle w:val="H2"/>
+        <w:rPr/>
+      </w:pPr>
+      <w:r>
+        <w:rPr/>
+        <w:t>Результати</w:t>
+      </w:r>
+    </w:p>
+    <w:p>
+      <w:pPr>
+        <w:pStyle w:val="H2"/>
+        <w:rPr/>
+      </w:pPr>
+      <w:r>
+        <w:rPr/>
+        <w:t>Таблиця</w:t>
+      </w:r>
+    </w:p>
+    <w:p>
+      <w:pPr>
+        <w:pStyle w:val="p11"/>
+        <w:rPr/>
+      </w:pPr>
+      <w:r>
+        <w:rPr/>
+      </w:r>
+    </w:p>
+    <w:tbl>
+      <w:tblPr>
+        <w:tblW w:w="5000" w:type="pct"/>
+        <w:jc w:val="left"/>
+        <w:tblInd w:w="55" w:type="dxa"/>
+        <w:tblLayout w:type="fixed"/>
+        <w:tblCellMar>
+          <w:top w:w="55" w:type="dxa"/>
+          <w:left w:w="55" w:type="dxa"/>
+          <w:bottom w:w="55" w:type="dxa"/>
+          <w:right w:w="55" w:type="dxa"/>
+        </w:tblCellMar>
+      </w:tblPr>
+      <w:tblGrid>
+        <w:gridCol w:w="908"/>
+        <w:gridCol w:w="902"/>
+        <w:gridCol w:w="902"/>
+        <w:gridCol w:w="902"/>
+        <w:gridCol w:w="902"/>
+        <w:gridCol w:w="902"/>
+        <w:gridCol w:w="902"/>
+        <w:gridCol w:w="902"/>
+        <w:gridCol w:w="902"/>
+        <w:gridCol w:w="902"/>
+      </w:tblGrid>
+      <w:tr>
+        <w:trPr/>
+        <w:tc>
+          <w:tcPr>
+            <w:tcW w:w="908" w:type="dxa"/>
+            <w:tcBorders>
+              <w:top w:val="single" w:sz="4" w:space="0" w:color="000000"/>
+              <w:left w:val="single" w:sz="4" w:space="0" w:color="000000"/>
+              <w:bottom w:val="single" w:sz="4" w:space="0" w:color="000000"/>
+            </w:tcBorders>
+          </w:tcPr>
+          <w:p>
+            <w:pPr>
+              <w:pStyle w:val="p11"/>
+              <w:ind w:hanging="0" w:left="0"/>
+              <w:rPr/>
+            </w:pPr>
+            <w:r>
+              <w:rPr>
+                <w:b w:val="false"/>
+                <w:i w:val="false"/>
+                <w:caps w:val="false"/>
+                <w:smallCaps w:val="false"/>
+                <w:spacing w:val="0"/>
+              </w:rPr>
+              <w:t>Н</w:t>
+            </w:r>
+            <w:r>
+              <w:rPr>
+                <w:b w:val="false"/>
+                <w:i w:val="false"/>
+                <w:caps w:val="false"/>
+                <w:smallCaps w:val="false"/>
+                <w:spacing w:val="0"/>
+              </w:rPr>
+              <w:t>азва архітектури нейромережі</w:t>
+            </w:r>
+          </w:p>
+        </w:tc>
+        <w:tc>
+          <w:tcPr>
+            <w:tcW w:w="902" w:type="dxa"/>
+            <w:tcBorders>
+              <w:top w:val="single" w:sz="4" w:space="0" w:color="000000"/>
+              <w:left w:val="single" w:sz="4" w:space="0" w:color="000000"/>
+              <w:bottom w:val="single" w:sz="4" w:space="0" w:color="000000"/>
+            </w:tcBorders>
+          </w:tcPr>
+          <w:p>
+            <w:pPr>
+              <w:pStyle w:val="p11"/>
+              <w:ind w:hanging="0" w:left="0"/>
+              <w:rPr/>
+            </w:pPr>
+            <w:r>
+              <w:rPr>
+                <w:b w:val="false"/>
+                <w:i w:val="false"/>
+                <w:caps w:val="false"/>
+                <w:smallCaps w:val="false"/>
+                <w:spacing w:val="0"/>
+              </w:rPr>
+              <w:t>К</w:t>
+            </w:r>
+            <w:r>
+              <w:rPr>
+                <w:b w:val="false"/>
+                <w:i w:val="false"/>
+                <w:caps w:val="false"/>
+                <w:smallCaps w:val="false"/>
+                <w:spacing w:val="0"/>
+              </w:rPr>
+              <w:t>ількість шарів</w:t>
+            </w:r>
+          </w:p>
+        </w:tc>
+        <w:tc>
+          <w:tcPr>
+            <w:tcW w:w="902" w:type="dxa"/>
+            <w:tcBorders>
+              <w:top w:val="single" w:sz="4" w:space="0" w:color="000000"/>
+              <w:left w:val="single" w:sz="4" w:space="0" w:color="000000"/>
+              <w:bottom w:val="single" w:sz="4" w:space="0" w:color="000000"/>
+            </w:tcBorders>
+          </w:tcPr>
+          <w:p>
+            <w:pPr>
+              <w:pStyle w:val="p11"/>
+              <w:ind w:hanging="0" w:left="0"/>
+              <w:rPr/>
+            </w:pPr>
+            <w:r>
+              <w:rPr>
+                <w:b w:val="false"/>
+                <w:i w:val="false"/>
+                <w:caps w:val="false"/>
+                <w:smallCaps w:val="false"/>
+                <w:spacing w:val="0"/>
+              </w:rPr>
+              <w:t>К</w:t>
+            </w:r>
+            <w:r>
+              <w:rPr>
+                <w:b w:val="false"/>
+                <w:i w:val="false"/>
+                <w:caps w:val="false"/>
+                <w:smallCaps w:val="false"/>
+                <w:spacing w:val="0"/>
+              </w:rPr>
+              <w:t>ількість нейронів у шарах</w:t>
+            </w:r>
+          </w:p>
+        </w:tc>
+        <w:tc>
+          <w:tcPr>
+            <w:tcW w:w="902" w:type="dxa"/>
+            <w:tcBorders>
+              <w:top w:val="single" w:sz="4" w:space="0" w:color="000000"/>
+              <w:left w:val="single" w:sz="4" w:space="0" w:color="000000"/>
+              <w:bottom w:val="single" w:sz="4" w:space="0" w:color="000000"/>
+            </w:tcBorders>
+          </w:tcPr>
+          <w:p>
+            <w:pPr>
+              <w:pStyle w:val="p11"/>
+              <w:ind w:hanging="0" w:left="0"/>
+              <w:rPr/>
+            </w:pPr>
+            <w:r>
+              <w:rPr>
+                <w:b w:val="false"/>
+                <w:i w:val="false"/>
+                <w:caps w:val="false"/>
+                <w:smallCaps w:val="false"/>
+                <w:spacing w:val="0"/>
+              </w:rPr>
+              <w:t>Ф</w:t>
+            </w:r>
+            <w:r>
+              <w:rPr>
+                <w:b w:val="false"/>
+                <w:i w:val="false"/>
+                <w:caps w:val="false"/>
+                <w:smallCaps w:val="false"/>
+                <w:spacing w:val="0"/>
+              </w:rPr>
+              <w:t>ункції активації нейронів у шарах</w:t>
+            </w:r>
+          </w:p>
+        </w:tc>
+        <w:tc>
+          <w:tcPr>
+            <w:tcW w:w="902" w:type="dxa"/>
+            <w:tcBorders>
+              <w:top w:val="single" w:sz="4" w:space="0" w:color="000000"/>
+              <w:left w:val="single" w:sz="4" w:space="0" w:color="000000"/>
+              <w:bottom w:val="single" w:sz="4" w:space="0" w:color="000000"/>
+            </w:tcBorders>
+          </w:tcPr>
+          <w:p>
+            <w:pPr>
+              <w:pStyle w:val="p11"/>
+              <w:ind w:hanging="0" w:left="0"/>
+              <w:rPr/>
+            </w:pPr>
+            <w:r>
+              <w:rPr>
+                <w:b w:val="false"/>
+                <w:i w:val="false"/>
+                <w:caps w:val="false"/>
+                <w:smallCaps w:val="false"/>
+                <w:spacing w:val="0"/>
+              </w:rPr>
+              <w:t>М</w:t>
+            </w:r>
+            <w:r>
+              <w:rPr>
+                <w:b w:val="false"/>
+                <w:i w:val="false"/>
+                <w:caps w:val="false"/>
+                <w:smallCaps w:val="false"/>
+                <w:spacing w:val="0"/>
+              </w:rPr>
+              <w:t>етод навчання</w:t>
+            </w:r>
+          </w:p>
+        </w:tc>
+        <w:tc>
+          <w:tcPr>
+            <w:tcW w:w="902" w:type="dxa"/>
+            <w:tcBorders>
+              <w:top w:val="single" w:sz="4" w:space="0" w:color="000000"/>
+              <w:left w:val="single" w:sz="4" w:space="0" w:color="000000"/>
+              <w:bottom w:val="single" w:sz="4" w:space="0" w:color="000000"/>
+            </w:tcBorders>
+          </w:tcPr>
+          <w:p>
+            <w:pPr>
+              <w:pStyle w:val="p11"/>
+              <w:ind w:hanging="0" w:left="0"/>
+              <w:rPr/>
+            </w:pPr>
+            <w:r>
+              <w:rPr>
+                <w:b w:val="false"/>
+                <w:i w:val="false"/>
+                <w:caps w:val="false"/>
+                <w:smallCaps w:val="false"/>
+                <w:spacing w:val="0"/>
+              </w:rPr>
+              <w:t>Ч</w:t>
+            </w:r>
+            <w:r>
+              <w:rPr>
+                <w:b w:val="false"/>
+                <w:i w:val="false"/>
+                <w:caps w:val="false"/>
+                <w:smallCaps w:val="false"/>
+                <w:spacing w:val="0"/>
+              </w:rPr>
+              <w:t>ас навчання</w:t>
+            </w:r>
+          </w:p>
+        </w:tc>
+        <w:tc>
+          <w:tcPr>
+            <w:tcW w:w="902" w:type="dxa"/>
+            <w:tcBorders>
+              <w:top w:val="single" w:sz="4" w:space="0" w:color="000000"/>
+              <w:left w:val="single" w:sz="4" w:space="0" w:color="000000"/>
+              <w:bottom w:val="single" w:sz="4" w:space="0" w:color="000000"/>
+            </w:tcBorders>
+          </w:tcPr>
+          <w:p>
+            <w:pPr>
+              <w:pStyle w:val="p11"/>
+              <w:ind w:hanging="0" w:left="0"/>
+              <w:rPr/>
+            </w:pPr>
+            <w:r>
+              <w:rPr>
+                <w:b w:val="false"/>
+                <w:i w:val="false"/>
+                <w:caps w:val="false"/>
+                <w:smallCaps w:val="false"/>
+                <w:spacing w:val="0"/>
+              </w:rPr>
+              <w:t>Ч</w:t>
+            </w:r>
+            <w:r>
+              <w:rPr>
+                <w:b w:val="false"/>
+                <w:i w:val="false"/>
+                <w:caps w:val="false"/>
+                <w:smallCaps w:val="false"/>
+                <w:spacing w:val="0"/>
+              </w:rPr>
+              <w:t>ас класифікації навченої мережі для навчальної вибірки</w:t>
+            </w:r>
+          </w:p>
+        </w:tc>
+        <w:tc>
+          <w:tcPr>
+            <w:tcW w:w="902" w:type="dxa"/>
+            <w:tcBorders>
+              <w:top w:val="single" w:sz="4" w:space="0" w:color="000000"/>
+              <w:left w:val="single" w:sz="4" w:space="0" w:color="000000"/>
+              <w:bottom w:val="single" w:sz="4" w:space="0" w:color="000000"/>
+            </w:tcBorders>
+          </w:tcPr>
+          <w:p>
+            <w:pPr>
+              <w:pStyle w:val="p11"/>
+              <w:ind w:hanging="0" w:left="0"/>
+              <w:rPr/>
+            </w:pPr>
+            <w:r>
+              <w:rPr>
+                <w:b w:val="false"/>
+                <w:i w:val="false"/>
+                <w:caps w:val="false"/>
+                <w:smallCaps w:val="false"/>
+                <w:spacing w:val="0"/>
+              </w:rPr>
+              <w:t>П</w:t>
+            </w:r>
+            <w:r>
+              <w:rPr>
+                <w:b w:val="false"/>
+                <w:i w:val="false"/>
+                <w:caps w:val="false"/>
+                <w:smallCaps w:val="false"/>
+                <w:spacing w:val="0"/>
+              </w:rPr>
+              <w:t>омилка класифікації для навчальної вибірки</w:t>
+            </w:r>
+          </w:p>
+        </w:tc>
+        <w:tc>
+          <w:tcPr>
+            <w:tcW w:w="902" w:type="dxa"/>
+            <w:tcBorders>
+              <w:top w:val="single" w:sz="4" w:space="0" w:color="000000"/>
+              <w:left w:val="single" w:sz="4" w:space="0" w:color="000000"/>
+              <w:bottom w:val="single" w:sz="4" w:space="0" w:color="000000"/>
+            </w:tcBorders>
+          </w:tcPr>
+          <w:p>
+            <w:pPr>
+              <w:pStyle w:val="p11"/>
+              <w:ind w:hanging="0" w:left="0"/>
+              <w:rPr/>
+            </w:pPr>
+            <w:r>
+              <w:rPr>
+                <w:b w:val="false"/>
+                <w:i w:val="false"/>
+                <w:caps w:val="false"/>
+                <w:smallCaps w:val="false"/>
+                <w:spacing w:val="0"/>
+              </w:rPr>
+              <w:t>Ч</w:t>
+            </w:r>
+            <w:r>
+              <w:rPr>
+                <w:b w:val="false"/>
+                <w:i w:val="false"/>
+                <w:caps w:val="false"/>
+                <w:smallCaps w:val="false"/>
+                <w:spacing w:val="0"/>
+              </w:rPr>
+              <w:t>ас класифікації навченої мережі для тестової вибірки</w:t>
+            </w:r>
+          </w:p>
+        </w:tc>
+        <w:tc>
+          <w:tcPr>
+            <w:tcW w:w="902" w:type="dxa"/>
+            <w:tcBorders>
+              <w:top w:val="single" w:sz="4" w:space="0" w:color="000000"/>
+              <w:left w:val="single" w:sz="4" w:space="0" w:color="000000"/>
+              <w:bottom w:val="single" w:sz="4" w:space="0" w:color="000000"/>
+              <w:right w:val="single" w:sz="4" w:space="0" w:color="000000"/>
+            </w:tcBorders>
+          </w:tcPr>
+          <w:p>
+            <w:pPr>
+              <w:pStyle w:val="p11"/>
+              <w:ind w:hanging="0" w:left="0"/>
+              <w:rPr/>
+            </w:pPr>
+            <w:r>
+              <w:rPr>
+                <w:b w:val="false"/>
+                <w:i w:val="false"/>
+                <w:caps w:val="false"/>
+                <w:smallCaps w:val="false"/>
+                <w:spacing w:val="0"/>
+              </w:rPr>
+              <w:t>П</w:t>
+            </w:r>
+            <w:r>
+              <w:rPr>
+                <w:b w:val="false"/>
+                <w:i w:val="false"/>
+                <w:caps w:val="false"/>
+                <w:smallCaps w:val="false"/>
+                <w:spacing w:val="0"/>
+              </w:rPr>
+              <w:t>омилка класифікації для тестової вибірки</w:t>
+            </w:r>
+          </w:p>
+        </w:tc>
+      </w:tr>
+      <w:tr>
+        <w:trPr/>
+        <w:tc>
+          <w:tcPr>
+            <w:tcW w:w="908" w:type="dxa"/>
+            <w:tcBorders>
+              <w:left w:val="single" w:sz="4" w:space="0" w:color="000000"/>
+              <w:bottom w:val="single" w:sz="4" w:space="0" w:color="000000"/>
+            </w:tcBorders>
+          </w:tcPr>
+          <w:p>
+            <w:pPr>
+              <w:pStyle w:val="p11"/>
+              <w:ind w:hanging="0" w:left="0"/>
+              <w:rPr>
+                <w:lang w:val="uk-UA"/>
+              </w:rPr>
+            </w:pPr>
+            <w:r>
+              <w:rPr>
+                <w:lang w:val="uk-UA"/>
+              </w:rPr>
+            </w:r>
+          </w:p>
+        </w:tc>
+        <w:tc>
+          <w:tcPr>
+            <w:tcW w:w="902" w:type="dxa"/>
+            <w:tcBorders>
+              <w:left w:val="single" w:sz="4" w:space="0" w:color="000000"/>
+              <w:bottom w:val="single" w:sz="4" w:space="0" w:color="000000"/>
+            </w:tcBorders>
+          </w:tcPr>
+          <w:p>
+            <w:pPr>
+              <w:pStyle w:val="p11"/>
+              <w:ind w:hanging="0" w:left="0"/>
+              <w:rPr>
+                <w:lang w:val="uk-UA"/>
+              </w:rPr>
+            </w:pPr>
+            <w:r>
+              <w:rPr>
+                <w:lang w:val="uk-UA"/>
+              </w:rPr>
+            </w:r>
+          </w:p>
+        </w:tc>
+        <w:tc>
+          <w:tcPr>
+            <w:tcW w:w="902" w:type="dxa"/>
+            <w:tcBorders>
+              <w:left w:val="single" w:sz="4" w:space="0" w:color="000000"/>
+              <w:bottom w:val="single" w:sz="4" w:space="0" w:color="000000"/>
+            </w:tcBorders>
+          </w:tcPr>
+          <w:p>
+            <w:pPr>
+              <w:pStyle w:val="p11"/>
+              <w:ind w:hanging="0" w:left="0"/>
+              <w:rPr>
+                <w:lang w:val="uk-UA"/>
+              </w:rPr>
+            </w:pPr>
+            <w:r>
+              <w:rPr>
+                <w:lang w:val="uk-UA"/>
+              </w:rPr>
+            </w:r>
+          </w:p>
+        </w:tc>
+        <w:tc>
+          <w:tcPr>
+            <w:tcW w:w="902" w:type="dxa"/>
+            <w:tcBorders>
+              <w:left w:val="single" w:sz="4" w:space="0" w:color="000000"/>
+              <w:bottom w:val="single" w:sz="4" w:space="0" w:color="000000"/>
+            </w:tcBorders>
+          </w:tcPr>
+          <w:p>
+            <w:pPr>
+              <w:pStyle w:val="p11"/>
+              <w:ind w:hanging="0" w:left="0"/>
+              <w:rPr>
+                <w:lang w:val="uk-UA"/>
+              </w:rPr>
+            </w:pPr>
+            <w:r>
+              <w:rPr>
+                <w:lang w:val="uk-UA"/>
+              </w:rPr>
+            </w:r>
+          </w:p>
+        </w:tc>
+        <w:tc>
+          <w:tcPr>
+            <w:tcW w:w="902" w:type="dxa"/>
+            <w:tcBorders>
+              <w:left w:val="single" w:sz="4" w:space="0" w:color="000000"/>
+              <w:bottom w:val="single" w:sz="4" w:space="0" w:color="000000"/>
+            </w:tcBorders>
+          </w:tcPr>
+          <w:p>
+            <w:pPr>
+              <w:pStyle w:val="p11"/>
+              <w:ind w:hanging="0" w:left="0"/>
+              <w:rPr>
+                <w:lang w:val="uk-UA"/>
+              </w:rPr>
+            </w:pPr>
+            <w:r>
+              <w:rPr>
+                <w:lang w:val="uk-UA"/>
+              </w:rPr>
+            </w:r>
+          </w:p>
+        </w:tc>
+        <w:tc>
+          <w:tcPr>
+            <w:tcW w:w="902" w:type="dxa"/>
+            <w:tcBorders>
+              <w:left w:val="single" w:sz="4" w:space="0" w:color="000000"/>
+              <w:bottom w:val="single" w:sz="4" w:space="0" w:color="000000"/>
+            </w:tcBorders>
+          </w:tcPr>
+          <w:p>
+            <w:pPr>
+              <w:pStyle w:val="p11"/>
+              <w:ind w:hanging="0" w:left="0"/>
+              <w:rPr>
+                <w:lang w:val="uk-UA"/>
+              </w:rPr>
+            </w:pPr>
+            <w:r>
+              <w:rPr>
+                <w:lang w:val="uk-UA"/>
+              </w:rPr>
+            </w:r>
+          </w:p>
+        </w:tc>
+        <w:tc>
+          <w:tcPr>
+            <w:tcW w:w="902" w:type="dxa"/>
+            <w:tcBorders>
+              <w:left w:val="single" w:sz="4" w:space="0" w:color="000000"/>
+              <w:bottom w:val="single" w:sz="4" w:space="0" w:color="000000"/>
+            </w:tcBorders>
+          </w:tcPr>
+          <w:p>
+            <w:pPr>
+              <w:pStyle w:val="p11"/>
+              <w:ind w:hanging="0" w:left="0"/>
+              <w:rPr>
+                <w:lang w:val="uk-UA"/>
+              </w:rPr>
+            </w:pPr>
+            <w:r>
+              <w:rPr>
+                <w:lang w:val="uk-UA"/>
+              </w:rPr>
+            </w:r>
+          </w:p>
+        </w:tc>
+        <w:tc>
+          <w:tcPr>
+            <w:tcW w:w="902" w:type="dxa"/>
+            <w:tcBorders>
+              <w:left w:val="single" w:sz="4" w:space="0" w:color="000000"/>
+              <w:bottom w:val="single" w:sz="4" w:space="0" w:color="000000"/>
+            </w:tcBorders>
+          </w:tcPr>
+          <w:p>
+            <w:pPr>
+              <w:pStyle w:val="p11"/>
+              <w:ind w:hanging="0" w:left="0"/>
+              <w:rPr>
+                <w:lang w:val="uk-UA"/>
+              </w:rPr>
+            </w:pPr>
+            <w:r>
+              <w:rPr>
+                <w:lang w:val="uk-UA"/>
+              </w:rPr>
+            </w:r>
+          </w:p>
+        </w:tc>
+        <w:tc>
+          <w:tcPr>
+            <w:tcW w:w="902" w:type="dxa"/>
+            <w:tcBorders>
+              <w:left w:val="single" w:sz="4" w:space="0" w:color="000000"/>
+              <w:bottom w:val="single" w:sz="4" w:space="0" w:color="000000"/>
+            </w:tcBorders>
+          </w:tcPr>
+          <w:p>
+            <w:pPr>
+              <w:pStyle w:val="p11"/>
+              <w:ind w:hanging="0" w:left="0"/>
+              <w:rPr>
+                <w:lang w:val="uk-UA"/>
+              </w:rPr>
+            </w:pPr>
+            <w:r>
+              <w:rPr>
+                <w:lang w:val="uk-UA"/>
+              </w:rPr>
+            </w:r>
+          </w:p>
+        </w:tc>
+        <w:tc>
+          <w:tcPr>
+            <w:tcW w:w="902" w:type="dxa"/>
+            <w:tcBorders>
+              <w:left w:val="single" w:sz="4" w:space="0" w:color="000000"/>
+              <w:bottom w:val="single" w:sz="4" w:space="0" w:color="000000"/>
+              <w:right w:val="single" w:sz="4" w:space="0" w:color="000000"/>
+            </w:tcBorders>
+          </w:tcPr>
+          <w:p>
+            <w:pPr>
+              <w:pStyle w:val="p11"/>
+              <w:ind w:hanging="0" w:left="0"/>
+              <w:rPr>
+                <w:lang w:val="uk-UA"/>
+              </w:rPr>
+            </w:pPr>
+            <w:r>
+              <w:rPr>
+                <w:lang w:val="uk-UA"/>
+              </w:rPr>
+            </w:r>
+          </w:p>
+        </w:tc>
+      </w:tr>
+    </w:tbl>
+    <w:p>
+      <w:pPr>
+        <w:pStyle w:val="Normal"/>
         <w:rPr/>
       </w:pPr>
       <w:r>
@@ -1684,12 +2337,12 @@
       <w:lang w:val="en-US" w:eastAsia="uk-UA"/>
     </w:rPr>
   </w:style>
-  <w:style w:type="character" w:styleId="user">
-    <w:name w:val="Символ нумерації (user)"/>
+  <w:style w:type="character" w:styleId="Style12">
+    <w:name w:val="Символ нумерації"/>
     <w:qFormat/>
     <w:rPr/>
   </w:style>
-  <w:style w:type="paragraph" w:styleId="Style12">
+  <w:style w:type="paragraph" w:styleId="Style13">
     <w:name w:val="Заголовок"/>
     <w:basedOn w:val="Normal"/>
     <w:next w:val="BodyText"/>
@@ -1699,7 +2352,7 @@
       <w:spacing w:before="240" w:after="120"/>
     </w:pPr>
     <w:rPr>
-      <w:rFonts w:ascii="Liberation Sans" w:hAnsi="Liberation Sans" w:eastAsia="Microsoft YaHei" w:cs="Arial Unicode MS"/>
+      <w:rFonts w:ascii="Liberation Sans" w:hAnsi="Liberation Sans" w:eastAsia="Microsoft YaHei" w:cs="Lucida Sans"/>
       <w:sz w:val="28"/>
       <w:szCs w:val="28"/>
     </w:rPr>
@@ -1736,7 +2389,7 @@
       <w:szCs w:val="24"/>
     </w:rPr>
   </w:style>
-  <w:style w:type="paragraph" w:styleId="Style13">
+  <w:style w:type="paragraph" w:styleId="Style14">
     <w:name w:val="Покажчик"/>
     <w:basedOn w:val="Normal"/>
     <w:qFormat/>
@@ -1744,10 +2397,10 @@
       <w:suppressLineNumbers/>
     </w:pPr>
     <w:rPr>
-      <w:rFonts w:cs="Arial Unicode MS"/>
-    </w:rPr>
-  </w:style>
-  <w:style w:type="paragraph" w:styleId="user1">
+      <w:rFonts w:cs="Lucida Sans"/>
+    </w:rPr>
+  </w:style>
+  <w:style w:type="paragraph" w:styleId="user">
     <w:name w:val="Заголовок (user)"/>
     <w:basedOn w:val="Normal"/>
     <w:next w:val="BodyText"/>
@@ -1757,12 +2410,12 @@
       <w:spacing w:before="240" w:after="120"/>
     </w:pPr>
     <w:rPr>
-      <w:rFonts w:ascii="Liberation Sans" w:hAnsi="Liberation Sans" w:eastAsia="Microsoft YaHei" w:cs="Lucida Sans"/>
+      <w:rFonts w:ascii="Liberation Sans" w:hAnsi="Liberation Sans" w:eastAsia="Microsoft YaHei" w:cs="Arial Unicode MS"/>
       <w:sz w:val="28"/>
       <w:szCs w:val="28"/>
     </w:rPr>
   </w:style>
-  <w:style w:type="paragraph" w:styleId="user2">
+  <w:style w:type="paragraph" w:styleId="user1">
     <w:name w:val="Покажчик (user)"/>
     <w:basedOn w:val="Normal"/>
     <w:qFormat/>
@@ -1770,12 +2423,12 @@
       <w:suppressLineNumbers/>
     </w:pPr>
     <w:rPr>
-      <w:rFonts w:cs="Lucida Sans"/>
+      <w:rFonts w:cs="Arial Unicode MS"/>
     </w:rPr>
   </w:style>
   <w:style w:type="paragraph" w:styleId="IndexHeading">
     <w:name w:val="index heading"/>
-    <w:basedOn w:val="Style12"/>
+    <w:basedOn w:val="user"/>
     <w:pPr/>
     <w:rPr/>
   </w:style>
@@ -2050,8 +2703,31 @@
     </w:pPr>
     <w:rPr/>
   </w:style>
-  <w:style w:type="numbering" w:styleId="Style14" w:default="1">
-    <w:name w:val="Без маркерів"/>
+  <w:style w:type="paragraph" w:styleId="Style15">
+    <w:name w:val="Вміст таблиці"/>
+    <w:basedOn w:val="Normal"/>
+    <w:qFormat/>
+    <w:pPr>
+      <w:widowControl w:val="false"/>
+      <w:suppressLineNumbers/>
+    </w:pPr>
+    <w:rPr/>
+  </w:style>
+  <w:style w:type="paragraph" w:styleId="Style16">
+    <w:name w:val="Заголовок таблиці"/>
+    <w:basedOn w:val="Style15"/>
+    <w:qFormat/>
+    <w:pPr>
+      <w:suppressLineNumbers/>
+      <w:jc w:val="center"/>
+    </w:pPr>
+    <w:rPr>
+      <w:b/>
+      <w:bCs/>
+    </w:rPr>
+  </w:style>
+  <w:style w:type="numbering" w:styleId="user2" w:default="1">
+    <w:name w:val="Без маркерів (user)"/>
     <w:uiPriority w:val="99"/>
     <w:semiHidden/>
     <w:unhideWhenUsed/>

</xml_diff>